<commit_message>
Apply a table cell's text-align to its paragraphs
Stacked on #58, which adds `AmbientParagraphFormat`. Merge that one first; this PR's base is its branch.

`text-align` on a `<td>` or `<th>` was ignored. `ApplyCellStyles` reads the cell's width, background, borders, padding and vertical alignment, and nothing read its horizontal alignment, so `<td style="text-align: right">` on a column of numbers came out left-aligned.

Word aligns paragraphs, not cells, so the cell's alignment and line height are now owed to the paragraphs inside it through the ambient paragraph format. A paragraph in the cell that declares its own alignment keeps it. The cell's margins, border and background stay on the cell.

Tests: `CellTextAlignReachesItsParagraphs`, `CellBorderAndBackgroundStayOnTheCell`.

Snapshots re-accepted, each because a cell alignment that was already in its html now applies: `CombinedCellStyles`, `FormattedHeader`, `FullFeatureDocx`.
</commit_message>
<xml_diff>
--- a/src/OpenXmlHtml.Tests/WordStyleComboTests.FullFeatureDocx.DotNet.verified.docx
+++ b/src/OpenXmlHtml.Tests/WordStyleComboTests.FullFeatureDocx.DotNet.verified.docx
@@ -153,6 +153,9 @@
         <w:tc>
           <w:tcPr/>
           <w:p>
+            <w:pPr>
+              <w:jc w:val="right"/>
+            </w:pPr>
             <w:r>
               <w:t xml:space="preserve">$12.3M</w:t>
             </w:r>
@@ -180,6 +183,9 @@
         <w:tc>
           <w:tcPr/>
           <w:p>
+            <w:pPr>
+              <w:jc w:val="right"/>
+            </w:pPr>
             <w:r>
               <w:t xml:space="preserve">$14.1M</w:t>
             </w:r>
@@ -207,6 +213,9 @@
         <w:tc>
           <w:tcPr/>
           <w:p>
+            <w:pPr>
+              <w:jc w:val="right"/>
+            </w:pPr>
             <w:r>
               <w:t xml:space="preserve">$13.8M</w:t>
             </w:r>
@@ -234,6 +243,9 @@
         <w:tc>
           <w:tcPr/>
           <w:p>
+            <w:pPr>
+              <w:jc w:val="right"/>
+            </w:pPr>
             <w:r>
               <w:t xml:space="preserve">$16.2M</w:t>
             </w:r>

</xml_diff>

<commit_message>
Apply a table cell's text-align to its paragraphs (#74)
Stacked on #58, which adds `AmbientParagraphFormat`. Merge that one first; this PR's base is its branch.

`text-align` on a `<td>` or `<th>` was ignored. `ApplyCellStyles` reads the cell's width, background, borders, padding and vertical alignment, and nothing read its horizontal alignment, so `<td style="text-align: right">` on a column of numbers came out left-aligned.

Word aligns paragraphs, not cells, so the cell's alignment and line height are now owed to the paragraphs inside it through the ambient paragraph format. A paragraph in the cell that declares its own alignment keeps it. The cell's margins, border and background stay on the cell.

Tests: `CellTextAlignReachesItsParagraphs`, `CellBorderAndBackgroundStayOnTheCell`.

Snapshots re-accepted, each because a cell alignment that was already in its html now applies: `CombinedCellStyles`, `FormattedHeader`, `FullFeatureDocx`.
</commit_message>
<xml_diff>
--- a/src/OpenXmlHtml.Tests/WordStyleComboTests.FullFeatureDocx.DotNet.verified.docx
+++ b/src/OpenXmlHtml.Tests/WordStyleComboTests.FullFeatureDocx.DotNet.verified.docx
@@ -153,6 +153,9 @@
         <w:tc>
           <w:tcPr/>
           <w:p>
+            <w:pPr>
+              <w:jc w:val="right"/>
+            </w:pPr>
             <w:r>
               <w:t xml:space="preserve">$12.3M</w:t>
             </w:r>
@@ -180,6 +183,9 @@
         <w:tc>
           <w:tcPr/>
           <w:p>
+            <w:pPr>
+              <w:jc w:val="right"/>
+            </w:pPr>
             <w:r>
               <w:t xml:space="preserve">$14.1M</w:t>
             </w:r>
@@ -207,6 +213,9 @@
         <w:tc>
           <w:tcPr/>
           <w:p>
+            <w:pPr>
+              <w:jc w:val="right"/>
+            </w:pPr>
             <w:r>
               <w:t xml:space="preserve">$13.8M</w:t>
             </w:r>
@@ -234,6 +243,9 @@
         <w:tc>
           <w:tcPr/>
           <w:p>
+            <w:pPr>
+              <w:jc w:val="right"/>
+            </w:pPr>
             <w:r>
               <w:t xml:space="preserve">$16.2M</w:t>
             </w:r>

</xml_diff>